<commit_message>
Convert HEC 직인동의서 fields to SDT content controls
Replace fragile text-string matching for 직인사용 동의서 상호/주소/대표자/날짜
with SDT (content controls, ids 900000001–4), filled by id in buildHecSdtMaps.
SDTs are addressed by stable id, immune to proofErr run-splitting that broke
the 상호 fill. Removes the corresponding text/paragraph replacements.
Verified: inject preserves layout (rendered), fill by id works 4/4, build OK.

Co-Authored-By: Claude Opus 4.8 (1M context) <noreply@anthropic.com>
</commit_message>
<xml_diff>
--- a/public/hec/template.docx
+++ b/public/hec/template.docx
@@ -3558,6 +3558,18 @@
         <w:spacing w:after="0"/>
         <w:jc w:val="both"/>
         <w:rPr>
+          <w:rFonts w:ascii="맑은 고딕" w:eastAsia="맑은 고딕" w:hAnsi="맑은 고딕" w:cs="Times New Roman" w:hint="eastAsia"/>
+          <w:sz w:val="20"/>
+          <w:szCs w:val="22"/>
+          <w14:ligatures w14:val="none"/>
+        </w:rPr>
+      </w:pPr>
+    </w:p>
+    <w:p>
+      <w:pPr>
+        <w:spacing w:after="0"/>
+        <w:jc w:val="both"/>
+        <w:rPr>
           <w:rFonts w:ascii="바탕" w:eastAsia="바탕" w:hAnsi="바탕" w:cs="굴림"/>
           <w:b/>
           <w:bCs/>
@@ -3581,7 +3593,6 @@
           <w:szCs w:val="32"/>
           <w14:ligatures w14:val="none"/>
         </w:rPr>
-        <w:lastRenderedPageBreak/>
         <w:t>[첨부1]</w:t>
       </w:r>
     </w:p>
@@ -8806,7 +8817,7 @@
         <w:spacing w:line="384" w:lineRule="auto"/>
         <w:textAlignment w:val="baseline"/>
         <w:rPr>
-          <w:rFonts w:ascii="바탕" w:eastAsia="바탕" w:hAnsi="바탕" w:cs="굴림" w:hint="eastAsia"/>
+          <w:rFonts w:ascii="바탕" w:eastAsia="바탕" w:hAnsi="바탕" w:cs="굴림"/>
           <w:b/>
           <w:bCs/>
           <w:color w:val="000000"/>
@@ -12378,36 +12389,79 @@
         </w:rPr>
         <w:t xml:space="preserve">상호: </w:t>
       </w:r>
-      <w:proofErr w:type="spellStart"/>
-      <w:r>
-        <w:rPr>
-          <w:rFonts w:hint="eastAsia"/>
-        </w:rPr>
-        <w:t>운암포레스힐</w:t>
-      </w:r>
-      <w:proofErr w:type="spellEnd"/>
-      <w:r>
-        <w:rPr>
-          <w:rFonts w:hint="eastAsia"/>
-        </w:rPr>
-        <w:t>2 관리사무소</w:t>
-      </w:r>
+      <w:sdt>
+        <w:sdtPr>
+          <w:rPr>
+            <w:rFonts w:hint="eastAsia"/>
+          </w:rPr>
+          <w:alias w:val="직인-상호"/>
+          <w:tag w:val="custName"/>
+          <w:id w:val="900000001"/>
+          <w:text/>
+        </w:sdtPr>
+        <w:sdtContent>
+          <w:r>
+            <w:rPr>
+              <w:rFonts w:hint="eastAsia"/>
+            </w:rPr>
+            <w:t xml:space="preserve">운암포레스힐2 관리사무소</w:t>
+          </w:r>
+        </w:sdtContent>
+      </w:sdt>
     </w:p>
     <w:p>
       <w:r>
         <w:rPr>
           <w:rFonts w:hint="eastAsia"/>
         </w:rPr>
-        <w:t>주소: 광주광역시 북구 대자실로 22</w:t>
-      </w:r>
+        <w:t xml:space="preserve">주소: </w:t>
+      </w:r>
+      <w:sdt>
+        <w:sdtPr>
+          <w:rPr>
+            <w:rFonts w:hint="eastAsia"/>
+          </w:rPr>
+          <w:alias w:val="직인-주소"/>
+          <w:tag w:val="custAddr"/>
+          <w:id w:val="900000002"/>
+          <w:text/>
+        </w:sdtPr>
+        <w:sdtContent>
+          <w:r>
+            <w:rPr>
+              <w:rFonts w:hint="eastAsia"/>
+            </w:rPr>
+            <w:t xml:space="preserve">광주광역시 북구 대자실로 22</w:t>
+          </w:r>
+        </w:sdtContent>
+      </w:sdt>
     </w:p>
     <w:p>
       <w:r>
         <w:rPr>
           <w:rFonts w:hint="eastAsia"/>
         </w:rPr>
-        <w:t>대표자: 이명주</w:t>
-      </w:r>
+        <w:t xml:space="preserve">대표자: </w:t>
+      </w:r>
+      <w:sdt>
+        <w:sdtPr>
+          <w:rPr>
+            <w:rFonts w:hint="eastAsia"/>
+          </w:rPr>
+          <w:alias w:val="직인-대표자"/>
+          <w:tag w:val="custRepresentative"/>
+          <w:id w:val="900000003"/>
+          <w:text/>
+        </w:sdtPr>
+        <w:sdtContent>
+          <w:r>
+            <w:rPr>
+              <w:rFonts w:hint="eastAsia"/>
+            </w:rPr>
+            <w:t xml:space="preserve">이명주</w:t>
+          </w:r>
+        </w:sdtContent>
+      </w:sdt>
     </w:p>
     <w:p/>
     <w:tbl>
@@ -12735,33 +12789,48 @@
           <w:bCs/>
         </w:rPr>
       </w:pPr>
-      <w:r>
-        <w:rPr>
-          <w:rFonts w:hint="eastAsia"/>
+      <w:sdt>
+        <w:sdtPr>
+          <w:rPr>
+            <w:rFonts w:hint="eastAsia"/>
+            <w:b/>
+            <w:bCs/>
+          </w:rPr>
+          <w:alias w:val="직인-날짜"/>
+          <w:tag w:val="sealDate"/>
+          <w:id w:val="900000004"/>
+          <w:text/>
+        </w:sdtPr>
+        <w:sdtContent>
+          <w:r>
+            <w:rPr>
+              <w:rFonts w:hint="eastAsia"/>
+              <w:b/>
+              <w:bCs/>
+            </w:rPr>
+            <w:t xml:space="preserve">2025년 9월 25일</w:t>
+          </w:r>
+        </w:sdtContent>
+      </w:sdt>
+    </w:p>
+    <w:p>
+      <w:pPr>
+        <w:jc w:val="center"/>
+        <w:rPr>
           <w:b/>
           <w:bCs/>
         </w:rPr>
-        <w:t>2025년 9월 25일</w:t>
-      </w:r>
+      </w:pPr>
     </w:p>
     <w:p>
       <w:pPr>
         <w:jc w:val="center"/>
-        <w:rPr>
-          <w:b/>
-          <w:bCs/>
-        </w:rPr>
       </w:pPr>
     </w:p>
     <w:p>
       <w:pPr>
         <w:jc w:val="center"/>
       </w:pPr>
-    </w:p>
-    <w:p>
-      <w:pPr>
-        <w:jc w:val="center"/>
-      </w:pPr>
       <w:r>
         <w:rPr>
           <w:rFonts w:ascii="Pretendard" w:eastAsia="굴림" w:hAnsi="Pretendard" w:cs="굴림"/>
@@ -12772,7 +12841,7 @@
           <w14:ligatures w14:val="none"/>
         </w:rPr>
         <w:drawing>
-          <wp:anchor distT="0" distB="0" distL="114300" distR="114300" simplePos="0" relativeHeight="251659264" behindDoc="0" locked="0" layoutInCell="1" allowOverlap="1" wp14:anchorId="6EF8B1ED" wp14:editId="166E61F7">
+          <wp:anchor distT="0" distB="0" distL="114300" distR="114300" simplePos="0" relativeHeight="251659264" behindDoc="0" locked="0" layoutInCell="1" allowOverlap="1" wp14:anchorId="6EF8B1ED" wp14:editId="7E0AB35D">
             <wp:simplePos x="0" y="0"/>
             <wp:positionH relativeFrom="column">
               <wp:posOffset>2372088</wp:posOffset>
@@ -25410,6 +25479,7 @@
     <w:rsid w:val="00536897"/>
     <w:rsid w:val="00986A8F"/>
     <w:rsid w:val="009D18C7"/>
+    <w:rsid w:val="00AD1AD4"/>
     <w:rsid w:val="00BC6D84"/>
     <w:rsid w:val="00CF3F5C"/>
     <w:rsid w:val="00D10C4E"/>

</xml_diff>

<commit_message>
Convert HEC 충전기수량·계약기간(표) to SDT content controls
Rebuild the two contract-body rows with embedded SDT slots (ids 900000011/12),
filled by id: 완속충전기 수량 ← installQty, 계약내용 계약기간(완속) ← contractTerm.
Removes the corresponding text/paragraph replacements and the fillContractTerm
table workaround. Verified: fill by id 6/6, layout preserved (rendered), build OK.

Co-Authored-By: Claude Opus 4.8 (1M context) <noreply@anthropic.com>
</commit_message>
<xml_diff>
--- a/public/hec/template.docx
+++ b/public/hec/template.docx
@@ -1536,7 +1536,6 @@
                 <w14:ligatures w14:val="none"/>
               </w:rPr>
             </w:pPr>
-            <w:proofErr w:type="spellStart"/>
             <w:r>
               <w:rPr>
                 <w:rFonts w:ascii="바탕" w:eastAsia="바탕" w:hAnsi="바탕" w:cs="굴림" w:hint="eastAsia"/>
@@ -1545,9 +1544,35 @@
                 <w:szCs w:val="22"/>
                 <w14:ligatures w14:val="none"/>
               </w:rPr>
-              <w:t>완속</w:t>
-            </w:r>
-            <w:proofErr w:type="spellEnd"/>
+              <w:t xml:space="preserve">완속 : </w:t>
+            </w:r>
+            <w:sdt>
+              <w:sdtPr>
+                <w:rPr>
+                  <w:rFonts w:ascii="바탕" w:eastAsia="바탕" w:hAnsi="바탕" w:cs="굴림" w:hint="eastAsia"/>
+                  <w:color w:val="000000"/>
+                  <w:kern w:val="0"/>
+                  <w:szCs w:val="22"/>
+                  <w14:ligatures w14:val="none"/>
+                </w:rPr>
+                <w:alias w:val="계약-계약기간"/>
+                <w:tag w:val="contractTerm"/>
+                <w:id w:val="900000012"/>
+                <w:text/>
+              </w:sdtPr>
+              <w:sdtContent>
+                <w:r>
+                  <w:rPr>
+                    <w:rFonts w:ascii="바탕" w:eastAsia="바탕" w:hAnsi="바탕" w:cs="굴림" w:hint="eastAsia"/>
+                    <w:color w:val="000000"/>
+                    <w:kern w:val="0"/>
+                    <w:szCs w:val="22"/>
+                    <w14:ligatures w14:val="none"/>
+                  </w:rPr>
+                  <w:t xml:space="preserve">    </w:t>
+                </w:r>
+              </w:sdtContent>
+            </w:sdt>
             <w:r>
               <w:rPr>
                 <w:rFonts w:ascii="바탕" w:eastAsia="바탕" w:hAnsi="바탕" w:cs="굴림" w:hint="eastAsia"/>
@@ -1556,27 +1581,7 @@
                 <w:szCs w:val="22"/>
                 <w14:ligatures w14:val="none"/>
               </w:rPr>
-              <w:t xml:space="preserve"> :  </w:t>
-            </w:r>
-            <w:r>
-              <w:rPr>
-                <w:rFonts w:ascii="바탕" w:eastAsia="바탕" w:hAnsi="바탕" w:cs="굴림" w:hint="eastAsia"/>
-                <w:color w:val="000000"/>
-                <w:kern w:val="0"/>
-                <w:szCs w:val="22"/>
-                <w14:ligatures w14:val="none"/>
-              </w:rPr>
-              <w:t xml:space="preserve"> </w:t>
-            </w:r>
-            <w:r>
-              <w:rPr>
-                <w:rFonts w:ascii="바탕" w:eastAsia="바탕" w:hAnsi="바탕" w:cs="굴림" w:hint="eastAsia"/>
-                <w:color w:val="000000"/>
-                <w:kern w:val="0"/>
-                <w:szCs w:val="22"/>
-                <w14:ligatures w14:val="none"/>
-              </w:rPr>
-              <w:t xml:space="preserve">  년 / 급속 :     년</w:t>
+              <w:t xml:space="preserve">년 / 급속 :     년</w:t>
             </w:r>
           </w:p>
         </w:tc>
@@ -2203,8 +2208,6 @@
                 <w14:ligatures w14:val="none"/>
               </w:rPr>
             </w:pPr>
-            <w:bookmarkStart w:id="2" w:name="OLE_LINK10"/>
-            <w:proofErr w:type="spellStart"/>
             <w:r>
               <w:rPr>
                 <w:rFonts w:ascii="바탕" w:eastAsia="바탕" w:hAnsi="바탕" w:cs="굴림" w:hint="eastAsia"/>
@@ -2213,9 +2216,35 @@
                 <w:szCs w:val="22"/>
                 <w14:ligatures w14:val="none"/>
               </w:rPr>
-              <w:t>완속충전기</w:t>
-            </w:r>
-            <w:proofErr w:type="spellEnd"/>
+              <w:t xml:space="preserve">완속충전기 : </w:t>
+            </w:r>
+            <w:sdt>
+              <w:sdtPr>
+                <w:rPr>
+                  <w:rFonts w:ascii="바탕" w:eastAsia="바탕" w:hAnsi="바탕" w:cs="굴림" w:hint="eastAsia"/>
+                  <w:color w:val="000000"/>
+                  <w:kern w:val="0"/>
+                  <w:szCs w:val="22"/>
+                  <w14:ligatures w14:val="none"/>
+                </w:rPr>
+                <w:alias w:val="계약-충전기수량"/>
+                <w:tag w:val="installQty"/>
+                <w:id w:val="900000011"/>
+                <w:text/>
+              </w:sdtPr>
+              <w:sdtContent>
+                <w:r>
+                  <w:rPr>
+                    <w:rFonts w:ascii="바탕" w:eastAsia="바탕" w:hAnsi="바탕" w:cs="굴림" w:hint="eastAsia"/>
+                    <w:color w:val="000000"/>
+                    <w:kern w:val="0"/>
+                    <w:szCs w:val="22"/>
+                    <w14:ligatures w14:val="none"/>
+                  </w:rPr>
+                  <w:t xml:space="preserve">  </w:t>
+                </w:r>
+              </w:sdtContent>
+            </w:sdt>
             <w:r>
               <w:rPr>
                 <w:rFonts w:ascii="바탕" w:eastAsia="바탕" w:hAnsi="바탕" w:cs="굴림" w:hint="eastAsia"/>
@@ -2224,9 +2253,8 @@
                 <w:szCs w:val="22"/>
                 <w14:ligatures w14:val="none"/>
               </w:rPr>
-              <w:t xml:space="preserve"> :   대(7kW / C type / 1CH)</w:t>
-            </w:r>
-            <w:bookmarkEnd w:id="2"/>
+              <w:t xml:space="preserve">대(7kW / C type / 1CH)</w:t>
+            </w:r>
           </w:p>
           <w:p>
             <w:pPr>

</xml_diff>

<commit_message>
Convert HEC 약관서두·수량공문 fields to SDT content controls
Batch 3: wrap the vulnerable single-node text fields as SDTs (ids 900000021–27),
filled by id: 약관 서두 법인명, 공문 회사명(발신/서명)·날짜·기준일자·등록대수·이메일.
Uses in-place run wrapping (position-based, so proofErr markers between runs are
included). Removes the corresponding text/paragraph replacements. 13/13 HEC SDTs
now fill; old sample text fully gone; layout identical (rendered); build OK.

Co-Authored-By: Claude Opus 4.8 (1M context) <noreply@anthropic.com>
</commit_message>
<xml_diff>
--- a/public/hec/template.docx
+++ b/public/hec/template.docx
@@ -3729,18 +3729,37 @@
           <w14:ligatures w14:val="none"/>
         </w:rPr>
       </w:pPr>
-      <w:r>
-        <w:rPr>
-          <w:rFonts w:ascii="바탕" w:eastAsia="바탕" w:hAnsi="바탕" w:cs="굴림" w:hint="eastAsia"/>
-          <w:b/>
-          <w:bCs/>
-          <w:color w:val="000000"/>
-          <w:kern w:val="0"/>
-          <w:szCs w:val="22"/>
-          <w14:ligatures w14:val="none"/>
-        </w:rPr>
-        <w:t>___________________________</w:t>
-      </w:r>
+      <w:sdt>
+        <w:sdtPr>
+          <w:rPr>
+            <w:rFonts w:ascii="바탕" w:eastAsia="바탕" w:hAnsi="바탕" w:cs="굴림" w:hint="eastAsia"/>
+            <w:b/>
+            <w:bCs/>
+            <w:color w:val="000000"/>
+            <w:kern w:val="0"/>
+            <w:szCs w:val="22"/>
+            <w14:ligatures w14:val="none"/>
+          </w:rPr>
+          <w:alias w:val="약관-부지제공자"/>
+          <w:tag w:val="custName"/>
+          <w:id w:val="900000021"/>
+          <w:text/>
+        </w:sdtPr>
+        <w:sdtContent>
+          <w:r>
+            <w:rPr>
+              <w:rFonts w:ascii="바탕" w:eastAsia="바탕" w:hAnsi="바탕" w:cs="굴림" w:hint="eastAsia"/>
+              <w:b/>
+              <w:bCs/>
+              <w:color w:val="000000"/>
+              <w:kern w:val="0"/>
+              <w:szCs w:val="22"/>
+              <w14:ligatures w14:val="none"/>
+            </w:rPr>
+            <w:t>___________________________</w:t>
+          </w:r>
+        </w:sdtContent>
+      </w:sdt>
       <w:r>
         <w:rPr>
           <w:rFonts w:ascii="바탕" w:eastAsia="바탕" w:hAnsi="바탕" w:cs="굴림" w:hint="eastAsia"/>
@@ -18607,68 +18626,108 @@
         <w:t xml:space="preserve">발   신 : </w:t>
       </w:r>
       <w:proofErr w:type="spellStart"/>
-      <w:r>
-        <w:rPr>
-          <w:rFonts w:ascii="맑은 고딕" w:eastAsia="맑은 고딕" w:hAnsi="맑은 고딕" w:cs="굴림" w:hint="eastAsia"/>
-          <w:b/>
-          <w:bCs/>
+      <w:sdt>
+        <w:sdtPr>
+          <w:rPr>
+            <w:rFonts w:ascii="맑은 고딕" w:eastAsia="맑은 고딕" w:hAnsi="맑은 고딕" w:cs="굴림" w:hint="eastAsia"/>
+            <w:b/>
+            <w:bCs/>
+            <w:color w:val="000000"/>
+            <w:kern w:val="0"/>
+            <w:sz w:val="20"/>
+            <w:szCs w:val="20"/>
+            <w14:ligatures w14:val="none"/>
+          </w:rPr>
+          <w:alias w:val="공문-회사명(발신)"/>
+          <w:tag w:val="custName"/>
+          <w:id w:val="900000024"/>
+          <w:text/>
+        </w:sdtPr>
+        <w:sdtContent>
+          <w:r>
+            <w:rPr>
+              <w:rFonts w:ascii="맑은 고딕" w:eastAsia="맑은 고딕" w:hAnsi="맑은 고딕" w:cs="굴림" w:hint="eastAsia"/>
+              <w:b/>
+              <w:bCs/>
+              <w:color w:val="000000"/>
+              <w:kern w:val="0"/>
+              <w:sz w:val="20"/>
+              <w:szCs w:val="20"/>
+              <w14:ligatures w14:val="none"/>
+            </w:rPr>
+            <w:t>현대재송동아파트</w:t>
+          </w:r>
+          <w:proofErr w:type="spellEnd"/>
+          <w:r>
+            <w:rPr>
+              <w:rFonts w:ascii="맑은 고딕" w:eastAsia="맑은 고딕" w:hAnsi="맑은 고딕" w:cs="굴림" w:hint="eastAsia"/>
+              <w:b/>
+              <w:bCs/>
+              <w:color w:val="000000"/>
+              <w:kern w:val="0"/>
+              <w:sz w:val="20"/>
+              <w:szCs w:val="20"/>
+              <w14:ligatures w14:val="none"/>
+            </w:rPr>
+            <w:t xml:space="preserve"> 관리사무소</w:t>
+          </w:r>
+        </w:sdtContent>
+      </w:sdt>
+      <w:r>
+        <w:rPr>
+          <w:rFonts w:ascii="함초롬바탕" w:eastAsia="함초롬바탕" w:hAnsi="함초롬바탕" w:cs="굴림" w:hint="eastAsia"/>
           <w:color w:val="000000"/>
           <w:kern w:val="0"/>
           <w:sz w:val="20"/>
           <w:szCs w:val="20"/>
           <w14:ligatures w14:val="none"/>
         </w:rPr>
-        <w:t>현대재송동아파트</w:t>
-      </w:r>
-      <w:proofErr w:type="spellEnd"/>
+        <w:br/>
+      </w:r>
       <w:r>
         <w:rPr>
           <w:rFonts w:ascii="맑은 고딕" w:eastAsia="맑은 고딕" w:hAnsi="맑은 고딕" w:cs="굴림" w:hint="eastAsia"/>
-          <w:b/>
-          <w:bCs/>
           <w:color w:val="000000"/>
           <w:kern w:val="0"/>
           <w:sz w:val="20"/>
           <w:szCs w:val="20"/>
           <w14:ligatures w14:val="none"/>
         </w:rPr>
-        <w:t xml:space="preserve"> 관리사무소</w:t>
-      </w:r>
-      <w:r>
-        <w:rPr>
-          <w:rFonts w:ascii="함초롬바탕" w:eastAsia="함초롬바탕" w:hAnsi="함초롬바탕" w:cs="굴림" w:hint="eastAsia"/>
-          <w:color w:val="000000"/>
-          <w:kern w:val="0"/>
-          <w:sz w:val="20"/>
-          <w:szCs w:val="20"/>
-          <w14:ligatures w14:val="none"/>
-        </w:rPr>
-        <w:br/>
-      </w:r>
-      <w:r>
-        <w:rPr>
-          <w:rFonts w:ascii="맑은 고딕" w:eastAsia="맑은 고딕" w:hAnsi="맑은 고딕" w:cs="굴림" w:hint="eastAsia"/>
-          <w:color w:val="000000"/>
-          <w:kern w:val="0"/>
-          <w:sz w:val="20"/>
-          <w:szCs w:val="20"/>
-          <w14:ligatures w14:val="none"/>
-        </w:rPr>
         <w:t xml:space="preserve">일   자 : </w:t>
       </w:r>
-      <w:r>
-        <w:rPr>
-          <w:rFonts w:ascii="맑은 고딕" w:eastAsia="맑은 고딕" w:hAnsi="맑은 고딕" w:cs="굴림" w:hint="eastAsia"/>
-          <w:b/>
-          <w:bCs/>
-          <w:color w:val="000000"/>
-          <w:kern w:val="0"/>
-          <w:sz w:val="20"/>
-          <w:szCs w:val="20"/>
-          <w14:ligatures w14:val="none"/>
-        </w:rPr>
-        <w:t>2025년 12월 01일</w:t>
-      </w:r>
+      <w:sdt>
+        <w:sdtPr>
+          <w:rPr>
+            <w:rFonts w:ascii="맑은 고딕" w:eastAsia="맑은 고딕" w:hAnsi="맑은 고딕" w:cs="굴림" w:hint="eastAsia"/>
+            <w:b/>
+            <w:bCs/>
+            <w:color w:val="000000"/>
+            <w:kern w:val="0"/>
+            <w:sz w:val="20"/>
+            <w:szCs w:val="20"/>
+            <w14:ligatures w14:val="none"/>
+          </w:rPr>
+          <w:alias w:val="공문-날짜"/>
+          <w:tag w:val="gongmunDate"/>
+          <w:id w:val="900000023"/>
+          <w:text/>
+        </w:sdtPr>
+        <w:sdtContent>
+          <w:r>
+            <w:rPr>
+              <w:rFonts w:ascii="맑은 고딕" w:eastAsia="맑은 고딕" w:hAnsi="맑은 고딕" w:cs="굴림" w:hint="eastAsia"/>
+              <w:b/>
+              <w:bCs/>
+              <w:color w:val="000000"/>
+              <w:kern w:val="0"/>
+              <w:sz w:val="20"/>
+              <w:szCs w:val="20"/>
+              <w14:ligatures w14:val="none"/>
+            </w:rPr>
+            <w:t>2025년 12월 01일</w:t>
+          </w:r>
+        </w:sdtContent>
+      </w:sdt>
     </w:p>
     <w:p>
       <w:pPr>
@@ -19022,8 +19081,37 @@
           <w:szCs w:val="20"/>
           <w14:ligatures w14:val="none"/>
         </w:rPr>
-        <w:t>  • 기준 일자 : 2025년 12월 기준</w:t>
-      </w:r>
+        <w:t xml:space="preserve">  • 기준 일자 : </w:t>
+      </w:r>
+      <w:sdt>
+        <w:sdtPr>
+          <w:rPr>
+            <w:rFonts w:ascii="맑은 고딕" w:eastAsia="맑은 고딕" w:hAnsi="맑은 고딕" w:cs="굴림" w:hint="eastAsia"/>
+            <w:color w:val="000000"/>
+            <w:kern w:val="0"/>
+            <w:sz w:val="20"/>
+            <w:szCs w:val="20"/>
+            <w14:ligatures w14:val="none"/>
+          </w:rPr>
+          <w:alias w:val="공문-기준일자"/>
+          <w:tag w:val="gongmunBaseDate"/>
+          <w:id w:val="900000025"/>
+          <w:text/>
+        </w:sdtPr>
+        <w:sdtContent>
+          <w:r>
+            <w:rPr>
+              <w:rFonts w:ascii="맑은 고딕" w:eastAsia="맑은 고딕" w:hAnsi="맑은 고딕" w:cs="굴림" w:hint="eastAsia"/>
+              <w:color w:val="000000"/>
+              <w:kern w:val="0"/>
+              <w:sz w:val="20"/>
+              <w:szCs w:val="20"/>
+              <w14:ligatures w14:val="none"/>
+            </w:rPr>
+            <w:t xml:space="preserve">2025년 12월 기준</w:t>
+          </w:r>
+        </w:sdtContent>
+      </w:sdt>
     </w:p>
     <w:p>
       <w:pPr>
@@ -19051,7 +19139,47 @@
           <w:szCs w:val="20"/>
           <w14:ligatures w14:val="none"/>
         </w:rPr>
-        <w:t>  • 등록 대수 : 6대</w:t>
+        <w:t xml:space="preserve">  • 등록 대수 : </w:t>
+      </w:r>
+      <w:sdt>
+        <w:sdtPr>
+          <w:rPr>
+            <w:rFonts w:ascii="맑은 고딕" w:eastAsia="맑은 고딕" w:hAnsi="맑은 고딕" w:cs="굴림" w:hint="eastAsia"/>
+            <w:color w:val="000000"/>
+            <w:kern w:val="0"/>
+            <w:sz w:val="20"/>
+            <w:szCs w:val="20"/>
+            <w14:ligatures w14:val="none"/>
+          </w:rPr>
+          <w:alias w:val="공문-등록대수"/>
+          <w:tag w:val="evCount"/>
+          <w:id w:val="900000026"/>
+          <w:text/>
+        </w:sdtPr>
+        <w:sdtContent>
+          <w:r>
+            <w:rPr>
+              <w:rFonts w:ascii="맑은 고딕" w:eastAsia="맑은 고딕" w:hAnsi="맑은 고딕" w:cs="굴림" w:hint="eastAsia"/>
+              <w:color w:val="000000"/>
+              <w:kern w:val="0"/>
+              <w:sz w:val="20"/>
+              <w:szCs w:val="20"/>
+              <w14:ligatures w14:val="none"/>
+            </w:rPr>
+            <w:t xml:space="preserve">6</w:t>
+          </w:r>
+        </w:sdtContent>
+      </w:sdt>
+      <w:r>
+        <w:rPr>
+          <w:rFonts w:ascii="맑은 고딕" w:eastAsia="맑은 고딕" w:hAnsi="맑은 고딕" w:cs="굴림" w:hint="eastAsia"/>
+          <w:color w:val="000000"/>
+          <w:kern w:val="0"/>
+          <w:sz w:val="20"/>
+          <w:szCs w:val="20"/>
+          <w14:ligatures w14:val="none"/>
+        </w:rPr>
+        <w:t xml:space="preserve">대</w:t>
       </w:r>
     </w:p>
     <w:p>
@@ -20695,6 +20823,53 @@
         </w:rPr>
       </w:pPr>
       <w:proofErr w:type="spellStart"/>
+      <w:sdt>
+        <w:sdtPr>
+          <w:rPr>
+            <w:rFonts w:ascii="맑은 고딕" w:eastAsia="맑은 고딕" w:hAnsi="맑은 고딕" w:cs="굴림" w:hint="eastAsia"/>
+            <w:b/>
+            <w:bCs/>
+            <w:color w:val="000000"/>
+            <w:kern w:val="0"/>
+            <w:sz w:val="40"/>
+            <w:szCs w:val="40"/>
+            <w14:ligatures w14:val="none"/>
+          </w:rPr>
+          <w:alias w:val="공문-회사명(서명)"/>
+          <w:tag w:val="custName"/>
+          <w:id w:val="900000027"/>
+          <w:text/>
+        </w:sdtPr>
+        <w:sdtContent>
+          <w:r>
+            <w:rPr>
+              <w:rFonts w:ascii="맑은 고딕" w:eastAsia="맑은 고딕" w:hAnsi="맑은 고딕" w:cs="굴림" w:hint="eastAsia"/>
+              <w:b/>
+              <w:bCs/>
+              <w:color w:val="000000"/>
+              <w:kern w:val="0"/>
+              <w:sz w:val="40"/>
+              <w:szCs w:val="40"/>
+              <w14:ligatures w14:val="none"/>
+            </w:rPr>
+            <w:t>현대재송동아파트</w:t>
+          </w:r>
+          <w:proofErr w:type="spellEnd"/>
+          <w:r>
+            <w:rPr>
+              <w:rFonts w:ascii="맑은 고딕" w:eastAsia="맑은 고딕" w:hAnsi="맑은 고딕" w:cs="굴림" w:hint="eastAsia"/>
+              <w:b/>
+              <w:bCs/>
+              <w:color w:val="000000"/>
+              <w:kern w:val="0"/>
+              <w:sz w:val="40"/>
+              <w:szCs w:val="40"/>
+              <w14:ligatures w14:val="none"/>
+            </w:rPr>
+            <w:t xml:space="preserve"> 관리사무소</w:t>
+          </w:r>
+        </w:sdtContent>
+      </w:sdt>
       <w:r>
         <w:rPr>
           <w:rFonts w:ascii="맑은 고딕" w:eastAsia="맑은 고딕" w:hAnsi="맑은 고딕" w:cs="굴림" w:hint="eastAsia"/>
@@ -20706,21 +20881,7 @@
           <w:szCs w:val="40"/>
           <w14:ligatures w14:val="none"/>
         </w:rPr>
-        <w:t>현대재송동아파트</w:t>
-      </w:r>
-      <w:proofErr w:type="spellEnd"/>
-      <w:r>
-        <w:rPr>
-          <w:rFonts w:ascii="맑은 고딕" w:eastAsia="맑은 고딕" w:hAnsi="맑은 고딕" w:cs="굴림" w:hint="eastAsia"/>
-          <w:b/>
-          <w:bCs/>
-          <w:color w:val="000000"/>
-          <w:kern w:val="0"/>
-          <w:sz w:val="40"/>
-          <w:szCs w:val="40"/>
-          <w14:ligatures w14:val="none"/>
-        </w:rPr>
-        <w:t xml:space="preserve"> 관리사무소      (인)</w:t>
+        <w:t xml:space="preserve">      (인)</w:t>
       </w:r>
     </w:p>
     <w:p>
@@ -20824,17 +20985,35 @@
         <w:t xml:space="preserve">TEL : 051-783-0672   E-MAIL : </w:t>
       </w:r>
       <w:hyperlink r:id="rId8" w:history="1">
-        <w:r>
-          <w:rPr>
-            <w:rStyle w:val="ae"/>
-            <w:rFonts w:ascii="맑은 고딕" w:eastAsia="맑은 고딕" w:hAnsi="맑은 고딕" w:cs="굴림" w:hint="eastAsia"/>
-            <w:kern w:val="0"/>
-            <w:sz w:val="20"/>
-            <w:szCs w:val="20"/>
-            <w14:ligatures w14:val="none"/>
-          </w:rPr>
-          <w:t>gs9966@naver.com</w:t>
-        </w:r>
+        <w:sdt>
+          <w:sdtPr>
+            <w:rPr>
+              <w:rStyle w:val="ae"/>
+              <w:rFonts w:ascii="맑은 고딕" w:eastAsia="맑은 고딕" w:hAnsi="맑은 고딕" w:cs="굴림" w:hint="eastAsia"/>
+              <w:kern w:val="0"/>
+              <w:sz w:val="20"/>
+              <w:szCs w:val="20"/>
+              <w14:ligatures w14:val="none"/>
+            </w:rPr>
+            <w:alias w:val="공문-이메일"/>
+            <w:tag w:val="custEmail"/>
+            <w:id w:val="900000022"/>
+            <w:text/>
+          </w:sdtPr>
+          <w:sdtContent>
+            <w:r>
+              <w:rPr>
+                <w:rStyle w:val="ae"/>
+                <w:rFonts w:ascii="맑은 고딕" w:eastAsia="맑은 고딕" w:hAnsi="맑은 고딕" w:cs="굴림" w:hint="eastAsia"/>
+                <w:kern w:val="0"/>
+                <w:sz w:val="20"/>
+                <w:szCs w:val="20"/>
+                <w14:ligatures w14:val="none"/>
+              </w:rPr>
+              <w:t>gs9966@naver.com</w:t>
+            </w:r>
+          </w:sdtContent>
+        </w:sdt>
       </w:hyperlink>
       <w:r>
         <w:rPr>

</xml_diff>